<commit_message>
update minh chung tuan 02
</commit_message>
<xml_diff>
--- a/GiapVietHoang_22659371_Tuan02.docx
+++ b/GiapVietHoang_22659371_Tuan02.docx
@@ -6,6 +6,27 @@
       <w:pPr>
         <w:rPr>
           <w:rFonts w:ascii="Times New Roman" w:hAnsi="Times New Roman" w:cs="Times New Roman"/>
+          <w:b/>
+          <w:sz w:val="26"/>
+          <w:szCs w:val="26"/>
+        </w:rPr>
+      </w:pPr>
+      <w:r>
+        <w:rPr>
+          <w:rFonts w:ascii="Times New Roman" w:hAnsi="Times New Roman" w:cs="Times New Roman"/>
+          <w:b/>
+          <w:sz w:val="26"/>
+          <w:szCs w:val="26"/>
+        </w:rPr>
+        <w:t>Giáp Việt Hoàng - 22659371</w:t>
+      </w:r>
+      <w:bookmarkStart w:id="0" w:name="_GoBack"/>
+      <w:bookmarkEnd w:id="0"/>
+    </w:p>
+    <w:p>
+      <w:pPr>
+        <w:rPr>
+          <w:rFonts w:ascii="Times New Roman" w:hAnsi="Times New Roman" w:cs="Times New Roman"/>
           <w:sz w:val="26"/>
           <w:szCs w:val="26"/>
         </w:rPr>
@@ -25,23 +46,7 @@
           <w:sz w:val="26"/>
           <w:szCs w:val="26"/>
         </w:rPr>
-        <w:t xml:space="preserve"> </w:t>
-      </w:r>
-      <w:r>
-        <w:rPr>
-          <w:rFonts w:ascii="Times New Roman" w:hAnsi="Times New Roman" w:cs="Times New Roman"/>
-          <w:sz w:val="26"/>
-          <w:szCs w:val="26"/>
-        </w:rPr>
-        <w:t>Sinh viên tự nghĩ ra bài tập áp dụ</w:t>
-      </w:r>
-      <w:r>
-        <w:rPr>
-          <w:rFonts w:ascii="Times New Roman" w:hAnsi="Times New Roman" w:cs="Times New Roman"/>
-          <w:sz w:val="26"/>
-          <w:szCs w:val="26"/>
-        </w:rPr>
-        <w:t>ng 2 Design Pattern: Singleton, Factory</w:t>
+        <w:t xml:space="preserve"> Sinh viên tự nghĩ ra bài tập áp dụng 2 Design Pattern: Singleton, Factory</w:t>
       </w:r>
     </w:p>
     <w:p>
@@ -65,14 +70,7 @@
           <w:sz w:val="26"/>
           <w:szCs w:val="26"/>
         </w:rPr>
-        <w:t xml:space="preserve"> </w:t>
-      </w:r>
-      <w:r>
-        <w:rPr>
-          <w:sz w:val="26"/>
-          <w:szCs w:val="26"/>
-        </w:rPr>
-        <w:t>Xây dựng một hệ thống thanh toán cho ứng dụng mua sắm online. Hệ thống cho phép người dùng thanh toán bằng nhiều phương thức khác nhau như Credit Card, PayPal và Momo.</w:t>
+        <w:t xml:space="preserve"> Xây dựng một hệ thống thanh toán cho ứng dụng mua sắm online. Hệ thống cho phép người dùng thanh toán bằng nhiều phương thức khác nhau như Credit Card, PayPal và Momo.</w:t>
       </w:r>
     </w:p>
     <w:p>
@@ -166,6 +164,7 @@
       <w:r>
         <w:rPr>
           <w:rFonts w:ascii="Times New Roman" w:hAnsi="Times New Roman" w:cs="Times New Roman"/>
+          <w:noProof/>
           <w:sz w:val="26"/>
           <w:szCs w:val="26"/>
         </w:rPr>
@@ -258,6 +257,7 @@
       <w:r>
         <w:rPr>
           <w:rFonts w:ascii="Times New Roman" w:hAnsi="Times New Roman" w:cs="Times New Roman"/>
+          <w:noProof/>
           <w:sz w:val="26"/>
           <w:szCs w:val="26"/>
         </w:rPr>
@@ -335,6 +335,7 @@
       <w:r>
         <w:rPr>
           <w:rFonts w:ascii="Times New Roman" w:hAnsi="Times New Roman" w:cs="Times New Roman"/>
+          <w:noProof/>
           <w:sz w:val="26"/>
           <w:szCs w:val="26"/>
         </w:rPr>
@@ -389,17 +390,7 @@
           <w:sz w:val="26"/>
           <w:szCs w:val="26"/>
         </w:rPr>
-        <w:t>Chạy chương trình</w:t>
-      </w:r>
-      <w:bookmarkStart w:id="0" w:name="_GoBack"/>
-      <w:bookmarkEnd w:id="0"/>
-      <w:r>
-        <w:rPr>
-          <w:rFonts w:ascii="Times New Roman" w:hAnsi="Times New Roman" w:cs="Times New Roman"/>
-          <w:sz w:val="26"/>
-          <w:szCs w:val="26"/>
-        </w:rPr>
-        <w:t>.</w:t>
+        <w:t>Chạy chương trình.</w:t>
       </w:r>
     </w:p>
     <w:p>

</xml_diff>